<commit_message>
pushing all mod 1 file revisions
</commit_message>
<xml_diff>
--- a/module-1/Sengvanhpheng-Assignment1_2.docx
+++ b/module-1/Sengvanhpheng-Assignment1_2.docx
@@ -84,7 +84,65 @@
       </w:r>
     </w:p>
     <w:p/>
-    <w:p/>
+    <w:p>
+      <w:r>
+        <w:br w:type="page"/>
+      </w:r>
+    </w:p>
+    <w:p>
+      <w:r>
+        <w:lastRenderedPageBreak/>
+        <w:t xml:space="preserve">GitHub csd-402 repository. Inside module-1 is the word doc. </w:t>
+      </w:r>
+    </w:p>
+    <w:p>
+      <w:r>
+        <w:rPr>
+          <w:noProof/>
+        </w:rPr>
+        <w:drawing>
+          <wp:inline distT="0" distB="0" distL="0" distR="0" wp14:anchorId="3172D2F3" wp14:editId="1E7D5AE0">
+            <wp:extent cx="5943600" cy="3063240"/>
+            <wp:effectExtent l="0" t="0" r="0" b="3810"/>
+            <wp:docPr id="1037031135" name="Picture 1"/>
+            <wp:cNvGraphicFramePr>
+              <a:graphicFrameLocks xmlns:a="http://schemas.openxmlformats.org/drawingml/2006/main" noChangeAspect="1"/>
+            </wp:cNvGraphicFramePr>
+            <a:graphic xmlns:a="http://schemas.openxmlformats.org/drawingml/2006/main">
+              <a:graphicData uri="http://schemas.openxmlformats.org/drawingml/2006/picture">
+                <pic:pic xmlns:pic="http://schemas.openxmlformats.org/drawingml/2006/picture">
+                  <pic:nvPicPr>
+                    <pic:cNvPr id="1037031135" name="Picture 1037031135"/>
+                    <pic:cNvPicPr/>
+                  </pic:nvPicPr>
+                  <pic:blipFill>
+                    <a:blip r:embed="rId8" cstate="print">
+                      <a:extLst>
+                        <a:ext uri="{28A0092B-C50C-407E-A947-70E740481C1C}">
+                          <a14:useLocalDpi xmlns:a14="http://schemas.microsoft.com/office/drawing/2010/main" val="0"/>
+                        </a:ext>
+                      </a:extLst>
+                    </a:blip>
+                    <a:stretch>
+                      <a:fillRect/>
+                    </a:stretch>
+                  </pic:blipFill>
+                  <pic:spPr>
+                    <a:xfrm>
+                      <a:off x="0" y="0"/>
+                      <a:ext cx="5943600" cy="3063240"/>
+                    </a:xfrm>
+                    <a:prstGeom prst="rect">
+                      <a:avLst/>
+                    </a:prstGeom>
+                  </pic:spPr>
+                </pic:pic>
+              </a:graphicData>
+            </a:graphic>
+          </wp:inline>
+        </w:drawing>
+      </w:r>
+    </w:p>
     <w:p/>
     <w:p/>
     <w:sectPr>
@@ -1333,6 +1391,21 @@
 </file>
 
 <file path=customXml/item1.xml><?xml version="1.0" encoding="utf-8"?>
+<p:properties xmlns:p="http://schemas.microsoft.com/office/2006/metadata/properties" xmlns:xsi="http://www.w3.org/2001/XMLSchema-instance" xmlns:pc="http://schemas.microsoft.com/office/infopath/2007/PartnerControls">
+  <documentManagement/>
+</p:properties>
+</file>
+
+<file path=customXml/item2.xml><?xml version="1.0" encoding="utf-8"?>
+<?mso-contentType ?>
+<FormTemplates xmlns="http://schemas.microsoft.com/sharepoint/v3/contenttype/forms">
+  <Display>DocumentLibraryForm</Display>
+  <Edit>DocumentLibraryForm</Edit>
+  <New>DocumentLibraryForm</New>
+</FormTemplates>
+</file>
+
+<file path=customXml/item3.xml><?xml version="1.0" encoding="utf-8"?>
 <ct:contentTypeSchema xmlns:ct="http://schemas.microsoft.com/office/2006/metadata/contentType" xmlns:ma="http://schemas.microsoft.com/office/2006/metadata/properties/metaAttributes" ct:_="" ma:_="" ma:contentTypeName="Document" ma:contentTypeID="0x010100CD849BA507DA304097E57B0522212BDF" ma:contentTypeVersion="8" ma:contentTypeDescription="Create a new document." ma:contentTypeScope="" ma:versionID="8d2912d8b775207aa2246d89ef8f3208">
   <xsd:schema xmlns:xsd="http://www.w3.org/2001/XMLSchema" xmlns:xs="http://www.w3.org/2001/XMLSchema" xmlns:p="http://schemas.microsoft.com/office/2006/metadata/properties" xmlns:ns3="5523b32d-9cae-4d61-9e40-376cb03dc78b" targetNamespace="http://schemas.microsoft.com/office/2006/metadata/properties" ma:root="true" ma:fieldsID="8f933344d018d2f46e97f754f748d52f" ns3:_="">
     <xsd:import namespace="5523b32d-9cae-4d61-9e40-376cb03dc78b"/>
@@ -1502,22 +1575,24 @@
 </ct:contentTypeSchema>
 </file>
 
-<file path=customXml/item2.xml><?xml version="1.0" encoding="utf-8"?>
-<?mso-contentType ?>
-<FormTemplates xmlns="http://schemas.microsoft.com/sharepoint/v3/contenttype/forms">
-  <Display>DocumentLibraryForm</Display>
-  <Edit>DocumentLibraryForm</Edit>
-  <New>DocumentLibraryForm</New>
-</FormTemplates>
+<file path=customXml/itemProps1.xml><?xml version="1.0" encoding="utf-8"?>
+<ds:datastoreItem xmlns:ds="http://schemas.openxmlformats.org/officeDocument/2006/customXml" ds:itemID="{9C129469-A7F8-465F-8E83-5913480ADDB8}">
+  <ds:schemaRefs>
+    <ds:schemaRef ds:uri="http://schemas.microsoft.com/office/2006/metadata/properties"/>
+    <ds:schemaRef ds:uri="http://schemas.microsoft.com/office/infopath/2007/PartnerControls"/>
+  </ds:schemaRefs>
+</ds:datastoreItem>
 </file>
 
-<file path=customXml/item3.xml><?xml version="1.0" encoding="utf-8"?>
-<p:properties xmlns:p="http://schemas.microsoft.com/office/2006/metadata/properties" xmlns:xsi="http://www.w3.org/2001/XMLSchema-instance" xmlns:pc="http://schemas.microsoft.com/office/infopath/2007/PartnerControls">
-  <documentManagement/>
-</p:properties>
+<file path=customXml/itemProps2.xml><?xml version="1.0" encoding="utf-8"?>
+<ds:datastoreItem xmlns:ds="http://schemas.openxmlformats.org/officeDocument/2006/customXml" ds:itemID="{F413CFEA-CB75-4180-8168-51362E876BDA}">
+  <ds:schemaRefs>
+    <ds:schemaRef ds:uri="http://schemas.microsoft.com/sharepoint/v3/contenttype/forms"/>
+  </ds:schemaRefs>
+</ds:datastoreItem>
 </file>
 
-<file path=customXml/itemProps1.xml><?xml version="1.0" encoding="utf-8"?>
+<file path=customXml/itemProps3.xml><?xml version="1.0" encoding="utf-8"?>
 <ds:datastoreItem xmlns:ds="http://schemas.openxmlformats.org/officeDocument/2006/customXml" ds:itemID="{4D335253-1330-4A03-BD35-9215E0C76677}">
   <ds:schemaRefs>
     <ds:schemaRef ds:uri="http://schemas.microsoft.com/office/2006/metadata/contentType"/>
@@ -1533,21 +1608,4 @@
     <ds:schemaRef ds:uri="http://schemas.microsoft.com/internal/obd"/>
   </ds:schemaRefs>
 </ds:datastoreItem>
-</file>
-
-<file path=customXml/itemProps2.xml><?xml version="1.0" encoding="utf-8"?>
-<ds:datastoreItem xmlns:ds="http://schemas.openxmlformats.org/officeDocument/2006/customXml" ds:itemID="{F413CFEA-CB75-4180-8168-51362E876BDA}">
-  <ds:schemaRefs>
-    <ds:schemaRef ds:uri="http://schemas.microsoft.com/sharepoint/v3/contenttype/forms"/>
-  </ds:schemaRefs>
-</ds:datastoreItem>
-</file>
-
-<file path=customXml/itemProps3.xml><?xml version="1.0" encoding="utf-8"?>
-<ds:datastoreItem xmlns:ds="http://schemas.openxmlformats.org/officeDocument/2006/customXml" ds:itemID="{9C129469-A7F8-465F-8E83-5913480ADDB8}">
-  <ds:schemaRefs>
-    <ds:schemaRef ds:uri="http://schemas.microsoft.com/office/2006/metadata/properties"/>
-    <ds:schemaRef ds:uri="http://schemas.microsoft.com/office/infopath/2007/PartnerControls"/>
-  </ds:schemaRefs>
-</ds:datastoreItem>
 </file>
</xml_diff>

<commit_message>
pushing all updated mod 1 files
</commit_message>
<xml_diff>
--- a/module-1/Sengvanhpheng-Assignment1_2.docx
+++ b/module-1/Sengvanhpheng-Assignment1_2.docx
@@ -29,10 +29,29 @@
     <w:p/>
     <w:p>
       <w:r>
+        <w:t>Link to GitHub:</w:t>
+      </w:r>
+    </w:p>
+    <w:p>
+      <w:hyperlink r:id="rId7" w:history="1">
+        <w:r>
+          <w:rPr>
+            <w:rStyle w:val="Hyperlink"/>
+          </w:rPr>
+          <w:t>https://github.com/ThyNoi/csd-402.git</w:t>
+        </w:r>
+      </w:hyperlink>
+    </w:p>
+    <w:p/>
+    <w:p>
+      <w:r>
         <w:t>Direct</w:t>
       </w:r>
       <w:r>
         <w:t>ory listing</w:t>
+      </w:r>
+      <w:r>
+        <w:t>:</w:t>
       </w:r>
     </w:p>
     <w:p>
@@ -56,7 +75,7 @@
                     <pic:cNvPicPr/>
                   </pic:nvPicPr>
                   <pic:blipFill>
-                    <a:blip r:embed="rId7">
+                    <a:blip r:embed="rId8">
                       <a:extLst>
                         <a:ext uri="{28A0092B-C50C-407E-A947-70E740481C1C}">
                           <a14:useLocalDpi xmlns:a14="http://schemas.microsoft.com/office/drawing/2010/main" val="0"/>
@@ -92,7 +111,10 @@
     <w:p>
       <w:r>
         <w:lastRenderedPageBreak/>
-        <w:t xml:space="preserve">GitHub csd-402 repository. Inside module-1 is the word doc. </w:t>
+        <w:t>GitHub csd-402 repository. Inside module-1 is the word doc</w:t>
+      </w:r>
+      <w:r>
+        <w:t>:</w:t>
       </w:r>
     </w:p>
     <w:p>
@@ -116,7 +138,7 @@
                     <pic:cNvPicPr/>
                   </pic:nvPicPr>
                   <pic:blipFill>
-                    <a:blip r:embed="rId8" cstate="print">
+                    <a:blip r:embed="rId9" cstate="print">
                       <a:extLst>
                         <a:ext uri="{28A0092B-C50C-407E-A947-70E740481C1C}">
                           <a14:useLocalDpi xmlns:a14="http://schemas.microsoft.com/office/drawing/2010/main" val="0"/>
@@ -1072,6 +1094,29 @@
       <w:spacing w:val="5"/>
     </w:rPr>
   </w:style>
+  <w:style w:type="character" w:styleId="Hyperlink">
+    <w:name w:val="Hyperlink"/>
+    <w:basedOn w:val="DefaultParagraphFont"/>
+    <w:uiPriority w:val="99"/>
+    <w:unhideWhenUsed/>
+    <w:rsid w:val="00D345E5"/>
+    <w:rPr>
+      <w:color w:val="467886" w:themeColor="hyperlink"/>
+      <w:u w:val="single"/>
+    </w:rPr>
+  </w:style>
+  <w:style w:type="character" w:styleId="UnresolvedMention">
+    <w:name w:val="Unresolved Mention"/>
+    <w:basedOn w:val="DefaultParagraphFont"/>
+    <w:uiPriority w:val="99"/>
+    <w:semiHidden/>
+    <w:unhideWhenUsed/>
+    <w:rsid w:val="00D345E5"/>
+    <w:rPr>
+      <w:color w:val="605E5C"/>
+      <w:shd w:val="clear" w:color="auto" w:fill="E1DFDD"/>
+    </w:rPr>
+  </w:style>
 </w:styles>
 </file>
 
@@ -1391,21 +1436,6 @@
 </file>
 
 <file path=customXml/item1.xml><?xml version="1.0" encoding="utf-8"?>
-<p:properties xmlns:p="http://schemas.microsoft.com/office/2006/metadata/properties" xmlns:xsi="http://www.w3.org/2001/XMLSchema-instance" xmlns:pc="http://schemas.microsoft.com/office/infopath/2007/PartnerControls">
-  <documentManagement/>
-</p:properties>
-</file>
-
-<file path=customXml/item2.xml><?xml version="1.0" encoding="utf-8"?>
-<?mso-contentType ?>
-<FormTemplates xmlns="http://schemas.microsoft.com/sharepoint/v3/contenttype/forms">
-  <Display>DocumentLibraryForm</Display>
-  <Edit>DocumentLibraryForm</Edit>
-  <New>DocumentLibraryForm</New>
-</FormTemplates>
-</file>
-
-<file path=customXml/item3.xml><?xml version="1.0" encoding="utf-8"?>
 <ct:contentTypeSchema xmlns:ct="http://schemas.microsoft.com/office/2006/metadata/contentType" xmlns:ma="http://schemas.microsoft.com/office/2006/metadata/properties/metaAttributes" ct:_="" ma:_="" ma:contentTypeName="Document" ma:contentTypeID="0x010100CD849BA507DA304097E57B0522212BDF" ma:contentTypeVersion="8" ma:contentTypeDescription="Create a new document." ma:contentTypeScope="" ma:versionID="8d2912d8b775207aa2246d89ef8f3208">
   <xsd:schema xmlns:xsd="http://www.w3.org/2001/XMLSchema" xmlns:xs="http://www.w3.org/2001/XMLSchema" xmlns:p="http://schemas.microsoft.com/office/2006/metadata/properties" xmlns:ns3="5523b32d-9cae-4d61-9e40-376cb03dc78b" targetNamespace="http://schemas.microsoft.com/office/2006/metadata/properties" ma:root="true" ma:fieldsID="8f933344d018d2f46e97f754f748d52f" ns3:_="">
     <xsd:import namespace="5523b32d-9cae-4d61-9e40-376cb03dc78b"/>
@@ -1575,24 +1605,22 @@
 </ct:contentTypeSchema>
 </file>
 
-<file path=customXml/itemProps1.xml><?xml version="1.0" encoding="utf-8"?>
-<ds:datastoreItem xmlns:ds="http://schemas.openxmlformats.org/officeDocument/2006/customXml" ds:itemID="{9C129469-A7F8-465F-8E83-5913480ADDB8}">
-  <ds:schemaRefs>
-    <ds:schemaRef ds:uri="http://schemas.microsoft.com/office/2006/metadata/properties"/>
-    <ds:schemaRef ds:uri="http://schemas.microsoft.com/office/infopath/2007/PartnerControls"/>
-  </ds:schemaRefs>
-</ds:datastoreItem>
+<file path=customXml/item2.xml><?xml version="1.0" encoding="utf-8"?>
+<?mso-contentType ?>
+<FormTemplates xmlns="http://schemas.microsoft.com/sharepoint/v3/contenttype/forms">
+  <Display>DocumentLibraryForm</Display>
+  <Edit>DocumentLibraryForm</Edit>
+  <New>DocumentLibraryForm</New>
+</FormTemplates>
 </file>
 
-<file path=customXml/itemProps2.xml><?xml version="1.0" encoding="utf-8"?>
-<ds:datastoreItem xmlns:ds="http://schemas.openxmlformats.org/officeDocument/2006/customXml" ds:itemID="{F413CFEA-CB75-4180-8168-51362E876BDA}">
-  <ds:schemaRefs>
-    <ds:schemaRef ds:uri="http://schemas.microsoft.com/sharepoint/v3/contenttype/forms"/>
-  </ds:schemaRefs>
-</ds:datastoreItem>
+<file path=customXml/item3.xml><?xml version="1.0" encoding="utf-8"?>
+<p:properties xmlns:p="http://schemas.microsoft.com/office/2006/metadata/properties" xmlns:xsi="http://www.w3.org/2001/XMLSchema-instance" xmlns:pc="http://schemas.microsoft.com/office/infopath/2007/PartnerControls">
+  <documentManagement/>
+</p:properties>
 </file>
 
-<file path=customXml/itemProps3.xml><?xml version="1.0" encoding="utf-8"?>
+<file path=customXml/itemProps1.xml><?xml version="1.0" encoding="utf-8"?>
 <ds:datastoreItem xmlns:ds="http://schemas.openxmlformats.org/officeDocument/2006/customXml" ds:itemID="{4D335253-1330-4A03-BD35-9215E0C76677}">
   <ds:schemaRefs>
     <ds:schemaRef ds:uri="http://schemas.microsoft.com/office/2006/metadata/contentType"/>
@@ -1608,4 +1636,21 @@
     <ds:schemaRef ds:uri="http://schemas.microsoft.com/internal/obd"/>
   </ds:schemaRefs>
 </ds:datastoreItem>
+</file>
+
+<file path=customXml/itemProps2.xml><?xml version="1.0" encoding="utf-8"?>
+<ds:datastoreItem xmlns:ds="http://schemas.openxmlformats.org/officeDocument/2006/customXml" ds:itemID="{F413CFEA-CB75-4180-8168-51362E876BDA}">
+  <ds:schemaRefs>
+    <ds:schemaRef ds:uri="http://schemas.microsoft.com/sharepoint/v3/contenttype/forms"/>
+  </ds:schemaRefs>
+</ds:datastoreItem>
+</file>
+
+<file path=customXml/itemProps3.xml><?xml version="1.0" encoding="utf-8"?>
+<ds:datastoreItem xmlns:ds="http://schemas.openxmlformats.org/officeDocument/2006/customXml" ds:itemID="{9C129469-A7F8-465F-8E83-5913480ADDB8}">
+  <ds:schemaRefs>
+    <ds:schemaRef ds:uri="http://schemas.microsoft.com/office/2006/metadata/properties"/>
+    <ds:schemaRef ds:uri="http://schemas.microsoft.com/office/infopath/2007/PartnerControls"/>
+  </ds:schemaRefs>
+</ds:datastoreItem>
 </file>
</xml_diff>